<commit_message>
My Task VPC 02 and Challenge 04
</commit_message>
<xml_diff>
--- a/VPC Task -10.docx
+++ b/VPC Task -10.docx
@@ -114,15 +114,7 @@
           <w:bCs/>
           <w:u w:val="single"/>
         </w:rPr>
-        <w:t>1.</w:t>
-      </w:r>
-      <w:r>
-        <w:rPr>
-          <w:b/>
-          <w:bCs/>
-          <w:u w:val="single"/>
-        </w:rPr>
-        <w:t>Create VPC with 2 private and 2 public subnets.</w:t>
+        <w:t>1.Create VPC with 2 private and 2 public subnets.</w:t>
       </w:r>
     </w:p>
     <w:p>
@@ -263,6 +255,7 @@
         <w:rPr>
           <w:b/>
           <w:bCs/>
+          <w:noProof/>
           <w:u w:val="single"/>
         </w:rPr>
         <w:drawing>
@@ -341,6 +334,7 @@
         <w:rPr>
           <w:b/>
           <w:bCs/>
+          <w:noProof/>
           <w:u w:val="single"/>
         </w:rPr>
         <w:lastRenderedPageBreak/>
@@ -608,6 +602,7 @@
         <w:rPr>
           <w:b/>
           <w:bCs/>
+          <w:noProof/>
           <w:u w:val="single"/>
         </w:rPr>
         <w:drawing>
@@ -909,6 +904,7 @@
         <w:rPr>
           <w:b/>
           <w:bCs/>
+          <w:noProof/>
           <w:u w:val="single"/>
         </w:rPr>
         <w:drawing>
@@ -1019,6 +1015,7 @@
         <w:rPr>
           <w:b/>
           <w:bCs/>
+          <w:noProof/>
           <w:u w:val="single"/>
         </w:rPr>
         <w:drawing>
@@ -1327,6 +1324,7 @@
         <w:rPr>
           <w:b/>
           <w:bCs/>
+          <w:noProof/>
           <w:u w:val="single"/>
           <w:lang w:val="en-US"/>
         </w:rPr>
@@ -1651,6 +1649,7 @@
         <w:rPr>
           <w:b/>
           <w:bCs/>
+          <w:noProof/>
           <w:u w:val="single"/>
           <w:lang w:val="en-US"/>
         </w:rPr>
@@ -1911,6 +1910,7 @@
         <w:rPr>
           <w:b/>
           <w:bCs/>
+          <w:noProof/>
           <w:u w:val="single"/>
           <w:lang w:val="en-US"/>
         </w:rPr>
@@ -2148,7 +2148,7 @@
     <w:p>
       <w:r>
         <w:pict w14:anchorId="470F1E98">
-          <v:rect id="_x0000_i1169" style="width:0;height:1.5pt" o:hralign="center" o:hrstd="t" o:hr="t" fillcolor="#a0a0a0" stroked="f"/>
+          <v:rect id="_x0000_i1025" style="width:0;height:1.5pt" o:hralign="center" o:hrstd="t" o:hr="t" fillcolor="#a0a0a0" stroked="f"/>
         </w:pict>
       </w:r>
     </w:p>
@@ -2211,7 +2211,7 @@
     <w:p>
       <w:r>
         <w:pict w14:anchorId="2A158E7A">
-          <v:rect id="_x0000_i1170" style="width:0;height:1.5pt" o:hralign="center" o:hrstd="t" o:hr="t" fillcolor="#a0a0a0" stroked="f"/>
+          <v:rect id="_x0000_i1026" style="width:0;height:1.5pt" o:hralign="center" o:hrstd="t" o:hr="t" fillcolor="#a0a0a0" stroked="f"/>
         </w:pict>
       </w:r>
     </w:p>
@@ -2274,7 +2274,7 @@
     <w:p>
       <w:r>
         <w:pict w14:anchorId="1807AF52">
-          <v:rect id="_x0000_i1171" style="width:0;height:1.5pt" o:hralign="center" o:hrstd="t" o:hr="t" fillcolor="#a0a0a0" stroked="f"/>
+          <v:rect id="_x0000_i1027" style="width:0;height:1.5pt" o:hralign="center" o:hrstd="t" o:hr="t" fillcolor="#a0a0a0" stroked="f"/>
         </w:pict>
       </w:r>
     </w:p>
@@ -2326,7 +2326,7 @@
     <w:p>
       <w:r>
         <w:pict w14:anchorId="79DD9DD3">
-          <v:rect id="_x0000_i1172" style="width:0;height:1.5pt" o:hralign="center" o:hrstd="t" o:hr="t" fillcolor="#a0a0a0" stroked="f"/>
+          <v:rect id="_x0000_i1028" style="width:0;height:1.5pt" o:hralign="center" o:hrstd="t" o:hr="t" fillcolor="#a0a0a0" stroked="f"/>
         </w:pict>
       </w:r>
     </w:p>
@@ -2400,7 +2400,7 @@
     <w:p>
       <w:r>
         <w:pict w14:anchorId="45FC9AF8">
-          <v:rect id="_x0000_i1173" style="width:0;height:1.5pt" o:hralign="center" o:hrstd="t" o:hr="t" fillcolor="#a0a0a0" stroked="f"/>
+          <v:rect id="_x0000_i1029" style="width:0;height:1.5pt" o:hralign="center" o:hrstd="t" o:hr="t" fillcolor="#a0a0a0" stroked="f"/>
         </w:pict>
       </w:r>
     </w:p>
@@ -2453,7 +2453,7 @@
     <w:p>
       <w:r>
         <w:pict w14:anchorId="06D1E48E">
-          <v:rect id="_x0000_i1174" style="width:0;height:1.5pt" o:hralign="center" o:hrstd="t" o:hr="t" fillcolor="#a0a0a0" stroked="f"/>
+          <v:rect id="_x0000_i1030" style="width:0;height:1.5pt" o:hralign="center" o:hrstd="t" o:hr="t" fillcolor="#a0a0a0" stroked="f"/>
         </w:pict>
       </w:r>
     </w:p>
@@ -2546,7 +2546,7 @@
     <w:p>
       <w:r>
         <w:pict w14:anchorId="3D39C180">
-          <v:rect id="_x0000_i1175" style="width:0;height:1.5pt" o:hralign="center" o:hrstd="t" o:hr="t" fillcolor="#a0a0a0" stroked="f"/>
+          <v:rect id="_x0000_i1031" style="width:0;height:1.5pt" o:hralign="center" o:hrstd="t" o:hr="t" fillcolor="#a0a0a0" stroked="f"/>
         </w:pict>
       </w:r>
     </w:p>
@@ -2598,7 +2598,7 @@
     <w:p>
       <w:r>
         <w:pict w14:anchorId="6BC121E4">
-          <v:rect id="_x0000_i1176" style="width:0;height:1.5pt" o:hralign="center" o:hrstd="t" o:hr="t" fillcolor="#a0a0a0" stroked="f"/>
+          <v:rect id="_x0000_i1032" style="width:0;height:1.5pt" o:hralign="center" o:hrstd="t" o:hr="t" fillcolor="#a0a0a0" stroked="f"/>
         </w:pict>
       </w:r>
     </w:p>
@@ -2696,6 +2696,7 @@
         <w:rPr>
           <w:b/>
           <w:bCs/>
+          <w:noProof/>
           <w:u w:val="single"/>
           <w:lang w:val="en-US"/>
         </w:rPr>
@@ -2759,6 +2760,7 @@
         <w:rPr>
           <w:b/>
           <w:bCs/>
+          <w:noProof/>
           <w:u w:val="single"/>
           <w:lang w:val="en-US"/>
         </w:rPr>
@@ -2813,6 +2815,7 @@
         <w:rPr>
           <w:b/>
           <w:bCs/>
+          <w:noProof/>
           <w:u w:val="single"/>
           <w:lang w:val="en-US"/>
         </w:rPr>
@@ -2938,6 +2941,7 @@
         <w:rPr>
           <w:b/>
           <w:bCs/>
+          <w:noProof/>
           <w:u w:val="single"/>
           <w:lang w:val="en-US"/>
         </w:rPr>
@@ -2991,6 +2995,7 @@
         <w:rPr>
           <w:b/>
           <w:bCs/>
+          <w:noProof/>
           <w:u w:val="single"/>
           <w:lang w:val="en-US"/>
         </w:rPr>
@@ -3137,7 +3142,7 @@
     <w:p>
       <w:r>
         <w:pict w14:anchorId="6A59C5E2">
-          <v:rect id="_x0000_i1221" style="width:0;height:1.5pt" o:hralign="center" o:hrstd="t" o:hr="t" fillcolor="#a0a0a0" stroked="f"/>
+          <v:rect id="_x0000_i1033" style="width:0;height:1.5pt" o:hralign="center" o:hrstd="t" o:hr="t" fillcolor="#a0a0a0" stroked="f"/>
         </w:pict>
       </w:r>
     </w:p>
@@ -3307,7 +3312,7 @@
     <w:p>
       <w:r>
         <w:pict w14:anchorId="11095395">
-          <v:rect id="_x0000_i1222" style="width:0;height:1.5pt" o:hralign="center" o:hrstd="t" o:hr="t" fillcolor="#a0a0a0" stroked="f"/>
+          <v:rect id="_x0000_i1034" style="width:0;height:1.5pt" o:hralign="center" o:hrstd="t" o:hr="t" fillcolor="#a0a0a0" stroked="f"/>
         </w:pict>
       </w:r>
     </w:p>
@@ -3400,17 +3405,7 @@
           <w:szCs w:val="32"/>
           <w:u w:val="single"/>
         </w:rPr>
-        <w:t>8.</w:t>
-      </w:r>
-      <w:r>
-        <w:rPr>
-          <w:b/>
-          <w:bCs/>
-          <w:sz w:val="32"/>
-          <w:szCs w:val="32"/>
-          <w:u w:val="single"/>
-        </w:rPr>
-        <w:t>Configure NAT gateway in public subnet and connect to private instance</w:t>
+        <w:t>8.Configure NAT gateway in public subnet and connect to private instance</w:t>
       </w:r>
       <w:r>
         <w:rPr>
@@ -3627,6 +3622,7 @@
         <w:rPr>
           <w:b/>
           <w:bCs/>
+          <w:noProof/>
           <w:u w:val="single"/>
         </w:rPr>
         <w:drawing>
@@ -3683,6 +3679,7 @@
       </w:pPr>
       <w:r>
         <w:rPr>
+          <w:noProof/>
           <w:lang w:val="en-US"/>
         </w:rPr>
         <w:drawing>
@@ -3737,6 +3734,7 @@
       </w:pPr>
       <w:r>
         <w:rPr>
+          <w:noProof/>
           <w:lang w:val="en-US"/>
         </w:rPr>
         <w:lastRenderedPageBreak/>
@@ -3875,7 +3873,7 @@
     <w:p>
       <w:r>
         <w:pict w14:anchorId="6BA1F347">
-          <v:rect id="_x0000_i1231" style="width:0;height:1.5pt" o:hralign="center" o:hrstd="t" o:hr="t" fillcolor="#a0a0a0" stroked="f"/>
+          <v:rect id="_x0000_i1035" style="width:0;height:1.5pt" o:hralign="center" o:hrstd="t" o:hr="t" fillcolor="#a0a0a0" stroked="f"/>
         </w:pict>
       </w:r>
     </w:p>
@@ -4120,17 +4118,7 @@
           <w:szCs w:val="28"/>
           <w:u w:val="single"/>
         </w:rPr>
-        <w:t xml:space="preserve"> </w:t>
-      </w:r>
-      <w:r>
-        <w:rPr>
-          <w:b/>
-          <w:bCs/>
-          <w:sz w:val="28"/>
-          <w:szCs w:val="28"/>
-          <w:u w:val="single"/>
-        </w:rPr>
-        <w:t>Install Apache Tomcat in private EC2 and deploy a sample app.</w:t>
+        <w:t xml:space="preserve"> Install Apache Tomcat in private EC2 and deploy a sample app.</w:t>
       </w:r>
     </w:p>
     <w:p>
@@ -4568,69 +4556,62 @@
           <w:lang w:val="en-US"/>
         </w:rPr>
       </w:pPr>
-    </w:p>
-    <w:p>
-      <w:pPr>
-        <w:rPr>
-          <w:b/>
-          <w:bCs/>
-          <w:sz w:val="20"/>
-          <w:szCs w:val="20"/>
-          <w:lang w:val="en-US"/>
-        </w:rPr>
-      </w:pPr>
-      <w:r>
-        <w:rPr>
-          <w:b/>
-          <w:bCs/>
-          <w:sz w:val="20"/>
-          <w:szCs w:val="20"/>
-          <w:lang w:val="en-US"/>
-        </w:rPr>
-        <w:t xml:space="preserve">Login to public </w:t>
-      </w:r>
-      <w:proofErr w:type="spellStart"/>
-      <w:r>
-        <w:rPr>
-          <w:b/>
-          <w:bCs/>
-          <w:sz w:val="20"/>
-          <w:szCs w:val="20"/>
-          <w:lang w:val="en-US"/>
-        </w:rPr>
-        <w:t>ip</w:t>
-      </w:r>
-      <w:proofErr w:type="spellEnd"/>
-      <w:r>
-        <w:rPr>
-          <w:b/>
-          <w:bCs/>
-          <w:sz w:val="20"/>
-          <w:szCs w:val="20"/>
-          <w:lang w:val="en-US"/>
-        </w:rPr>
-        <w:t xml:space="preserve"> account </w:t>
-      </w:r>
-    </w:p>
-    <w:p>
-      <w:pPr>
-        <w:rPr>
-          <w:sz w:val="20"/>
-          <w:szCs w:val="20"/>
-          <w:lang w:val="en-US"/>
-        </w:rPr>
-      </w:pPr>
-      <w:r>
-        <w:rPr>
+      <w:r>
+        <w:rPr>
+          <w:b/>
+          <w:bCs/>
+          <w:sz w:val="20"/>
+          <w:szCs w:val="20"/>
+          <w:lang w:val="en-US"/>
+        </w:rPr>
+        <w:br/>
+      </w:r>
+      <w:r>
+        <w:rPr>
+          <w:sz w:val="20"/>
+          <w:szCs w:val="20"/>
+          <w:lang w:val="en-US"/>
+        </w:rPr>
+        <w:br/>
+      </w:r>
+      <w:r>
+        <w:rPr>
+          <w:sz w:val="20"/>
+          <w:szCs w:val="20"/>
+          <w:lang w:val="en-US"/>
+        </w:rPr>
+        <w:br/>
+      </w:r>
+    </w:p>
+    <w:p>
+      <w:pPr>
+        <w:rPr>
+          <w:sz w:val="20"/>
+          <w:szCs w:val="20"/>
+          <w:lang w:val="en-US"/>
+        </w:rPr>
+      </w:pPr>
+    </w:p>
+    <w:p>
+      <w:pPr>
+        <w:rPr>
+          <w:sz w:val="20"/>
+          <w:szCs w:val="20"/>
+          <w:lang w:val="en-US"/>
+        </w:rPr>
+      </w:pPr>
+      <w:r>
+        <w:rPr>
+          <w:noProof/>
           <w:sz w:val="20"/>
           <w:szCs w:val="20"/>
           <w:lang w:val="en-US"/>
         </w:rPr>
         <w:drawing>
-          <wp:inline distT="0" distB="0" distL="0" distR="0" wp14:anchorId="463D636D" wp14:editId="211A11B9">
-            <wp:extent cx="5731510" cy="2456815"/>
-            <wp:effectExtent l="0" t="0" r="2540" b="635"/>
-            <wp:docPr id="275226203" name="Picture 1"/>
+          <wp:inline distT="0" distB="0" distL="0" distR="0" wp14:anchorId="7715E406" wp14:editId="1500D2AB">
+            <wp:extent cx="5731510" cy="2537460"/>
+            <wp:effectExtent l="0" t="0" r="2540" b="0"/>
+            <wp:docPr id="1175980975" name="Picture 2"/>
             <wp:cNvGraphicFramePr>
               <a:graphicFrameLocks xmlns:a="http://schemas.openxmlformats.org/drawingml/2006/main" noChangeAspect="1"/>
             </wp:cNvGraphicFramePr>
@@ -4638,11 +4619,17 @@
               <a:graphicData uri="http://schemas.openxmlformats.org/drawingml/2006/picture">
                 <pic:pic xmlns:pic="http://schemas.openxmlformats.org/drawingml/2006/picture">
                   <pic:nvPicPr>
-                    <pic:cNvPr id="275226203" name=""/>
+                    <pic:cNvPr id="1175980975" name="Picture 1175980975"/>
                     <pic:cNvPicPr/>
                   </pic:nvPicPr>
                   <pic:blipFill>
-                    <a:blip r:embed="rId23"/>
+                    <a:blip r:embed="rId23">
+                      <a:extLst>
+                        <a:ext uri="{28A0092B-C50C-407E-A947-70E740481C1C}">
+                          <a14:useLocalDpi xmlns:a14="http://schemas.microsoft.com/office/drawing/2010/main" val="0"/>
+                        </a:ext>
+                      </a:extLst>
+                    </a:blip>
                     <a:stretch>
                       <a:fillRect/>
                     </a:stretch>
@@ -4650,7 +4637,7 @@
                   <pic:spPr>
                     <a:xfrm>
                       <a:off x="0" y="0"/>
-                      <a:ext cx="5731510" cy="2456815"/>
+                      <a:ext cx="5731510" cy="2537460"/>
                     </a:xfrm>
                     <a:prstGeom prst="rect">
                       <a:avLst/>
@@ -4662,146 +4649,30 @@
           </wp:inline>
         </w:drawing>
       </w:r>
-      <w:r>
-        <w:rPr>
-          <w:sz w:val="20"/>
-          <w:szCs w:val="20"/>
-          <w:lang w:val="en-US"/>
-        </w:rPr>
-        <w:br/>
-      </w:r>
-      <w:r>
-        <w:rPr>
-          <w:sz w:val="20"/>
-          <w:szCs w:val="20"/>
-          <w:lang w:val="en-US"/>
-        </w:rPr>
-        <w:br/>
-      </w:r>
-    </w:p>
-    <w:p>
-      <w:pPr>
-        <w:rPr>
-          <w:b/>
-          <w:bCs/>
-          <w:sz w:val="20"/>
-          <w:szCs w:val="20"/>
-          <w:lang w:val="en-US"/>
-        </w:rPr>
-      </w:pPr>
-      <w:r>
-        <w:rPr>
-          <w:sz w:val="20"/>
-          <w:szCs w:val="20"/>
-          <w:lang w:val="en-US"/>
-        </w:rPr>
-        <w:br/>
-      </w:r>
-    </w:p>
-    <w:p>
-      <w:pPr>
-        <w:rPr>
-          <w:b/>
-          <w:bCs/>
-          <w:sz w:val="20"/>
-          <w:szCs w:val="20"/>
-          <w:lang w:val="en-US"/>
-        </w:rPr>
-      </w:pPr>
-    </w:p>
-    <w:p>
-      <w:pPr>
-        <w:rPr>
-          <w:b/>
-          <w:bCs/>
-          <w:sz w:val="20"/>
-          <w:szCs w:val="20"/>
-          <w:lang w:val="en-US"/>
-        </w:rPr>
-      </w:pPr>
-      <w:r>
-        <w:rPr>
-          <w:b/>
-          <w:bCs/>
-          <w:sz w:val="20"/>
-          <w:szCs w:val="20"/>
-          <w:lang w:val="en-US"/>
-        </w:rPr>
-        <w:t>From public</w:t>
-      </w:r>
-      <w:r>
-        <w:rPr>
-          <w:b/>
-          <w:bCs/>
-          <w:sz w:val="20"/>
-          <w:szCs w:val="20"/>
-          <w:lang w:val="en-US"/>
-        </w:rPr>
-        <w:t xml:space="preserve"> </w:t>
-      </w:r>
-      <w:r>
-        <w:rPr>
-          <w:b/>
-          <w:bCs/>
-          <w:sz w:val="20"/>
-          <w:szCs w:val="20"/>
-          <w:lang w:val="en-US"/>
-        </w:rPr>
-        <w:t xml:space="preserve">to </w:t>
-      </w:r>
-      <w:r>
-        <w:rPr>
-          <w:b/>
-          <w:bCs/>
-          <w:sz w:val="20"/>
-          <w:szCs w:val="20"/>
-          <w:lang w:val="en-US"/>
-        </w:rPr>
-        <w:t>login P</w:t>
-      </w:r>
-      <w:r>
-        <w:rPr>
-          <w:b/>
-          <w:bCs/>
-          <w:sz w:val="20"/>
-          <w:szCs w:val="20"/>
-          <w:lang w:val="en-US"/>
-        </w:rPr>
-        <w:t xml:space="preserve">rivate </w:t>
-      </w:r>
-      <w:proofErr w:type="spellStart"/>
-      <w:r>
-        <w:rPr>
-          <w:b/>
-          <w:bCs/>
-          <w:sz w:val="20"/>
-          <w:szCs w:val="20"/>
-          <w:lang w:val="en-US"/>
-        </w:rPr>
-        <w:t>ip</w:t>
-      </w:r>
-      <w:proofErr w:type="spellEnd"/>
-    </w:p>
-    <w:p>
-      <w:pPr>
-        <w:rPr>
-          <w:sz w:val="20"/>
-          <w:szCs w:val="20"/>
-          <w:lang w:val="en-US"/>
-        </w:rPr>
-      </w:pPr>
-      <w:r>
-        <w:rPr>
+    </w:p>
+    <w:p>
+      <w:pPr>
+        <w:rPr>
+          <w:b/>
+          <w:bCs/>
+          <w:sz w:val="28"/>
+          <w:szCs w:val="28"/>
+          <w:u w:val="single"/>
+        </w:rPr>
+      </w:pPr>
+      <w:r>
+        <w:rPr>
+          <w:noProof/>
           <w:sz w:val="20"/>
           <w:szCs w:val="20"/>
           <w:lang w:val="en-US"/>
         </w:rPr>
         <w:lastRenderedPageBreak/>
         <w:drawing>
-          <wp:inline distT="0" distB="0" distL="0" distR="0" wp14:anchorId="2D78C286" wp14:editId="6266294F">
-            <wp:extent cx="5731510" cy="2138045"/>
-            <wp:effectExtent l="0" t="0" r="2540" b="0"/>
-            <wp:docPr id="1827188724" name="Picture 1"/>
+          <wp:inline distT="0" distB="0" distL="0" distR="0" wp14:anchorId="0770032F" wp14:editId="4F2DD9DE">
+            <wp:extent cx="5731510" cy="3441700"/>
+            <wp:effectExtent l="0" t="0" r="2540" b="6350"/>
+            <wp:docPr id="889372477" name="Picture 3"/>
             <wp:cNvGraphicFramePr>
               <a:graphicFrameLocks xmlns:a="http://schemas.openxmlformats.org/drawingml/2006/main" noChangeAspect="1"/>
             </wp:cNvGraphicFramePr>
@@ -4809,11 +4680,17 @@
               <a:graphicData uri="http://schemas.openxmlformats.org/drawingml/2006/picture">
                 <pic:pic xmlns:pic="http://schemas.openxmlformats.org/drawingml/2006/picture">
                   <pic:nvPicPr>
-                    <pic:cNvPr id="1827188724" name=""/>
+                    <pic:cNvPr id="889372477" name="Picture 889372477"/>
                     <pic:cNvPicPr/>
                   </pic:nvPicPr>
                   <pic:blipFill>
-                    <a:blip r:embed="rId24"/>
+                    <a:blip r:embed="rId24" cstate="print">
+                      <a:extLst>
+                        <a:ext uri="{28A0092B-C50C-407E-A947-70E740481C1C}">
+                          <a14:useLocalDpi xmlns:a14="http://schemas.microsoft.com/office/drawing/2010/main" val="0"/>
+                        </a:ext>
+                      </a:extLst>
+                    </a:blip>
                     <a:stretch>
                       <a:fillRect/>
                     </a:stretch>
@@ -4821,7 +4698,7 @@
                   <pic:spPr>
                     <a:xfrm>
                       <a:off x="0" y="0"/>
-                      <a:ext cx="5731510" cy="2138045"/>
+                      <a:ext cx="5731510" cy="3441700"/>
                     </a:xfrm>
                     <a:prstGeom prst="rect">
                       <a:avLst/>
@@ -4833,63 +4710,18 @@
           </wp:inline>
         </w:drawing>
       </w:r>
-    </w:p>
-    <w:p>
-      <w:pPr>
-        <w:rPr>
-          <w:sz w:val="20"/>
-          <w:szCs w:val="20"/>
-          <w:lang w:val="en-US"/>
-        </w:rPr>
-      </w:pPr>
-    </w:p>
-    <w:p>
-      <w:pPr>
-        <w:rPr>
-          <w:sz w:val="20"/>
-          <w:szCs w:val="20"/>
-          <w:lang w:val="en-US"/>
-        </w:rPr>
-      </w:pPr>
-      <w:r>
-        <w:rPr>
-          <w:b/>
-          <w:bCs/>
-          <w:sz w:val="20"/>
-          <w:szCs w:val="20"/>
-          <w:lang w:val="en-US"/>
-        </w:rPr>
-        <w:t>Installed Java 21</w:t>
-      </w:r>
-      <w:r>
-        <w:rPr>
-          <w:b/>
-          <w:bCs/>
-          <w:sz w:val="20"/>
-          <w:szCs w:val="20"/>
-          <w:lang w:val="en-US"/>
-        </w:rPr>
-        <w:br/>
-      </w:r>
-      <w:r>
-        <w:rPr>
-          <w:sz w:val="20"/>
-          <w:szCs w:val="20"/>
-          <w:lang w:val="en-US"/>
-        </w:rPr>
-        <w:br/>
-      </w:r>
-      <w:r>
-        <w:rPr>
+      <w:r>
+        <w:rPr>
+          <w:noProof/>
           <w:sz w:val="20"/>
           <w:szCs w:val="20"/>
           <w:lang w:val="en-US"/>
         </w:rPr>
         <w:drawing>
-          <wp:inline distT="0" distB="0" distL="0" distR="0" wp14:anchorId="7E470618" wp14:editId="6076EA2B">
-            <wp:extent cx="5731510" cy="2842895"/>
-            <wp:effectExtent l="0" t="0" r="2540" b="0"/>
-            <wp:docPr id="2055710948" name="Picture 1"/>
+          <wp:inline distT="0" distB="0" distL="0" distR="0" wp14:anchorId="5DDA27CC" wp14:editId="073D2129">
+            <wp:extent cx="5731510" cy="3402965"/>
+            <wp:effectExtent l="0" t="0" r="2540" b="6985"/>
+            <wp:docPr id="1622712656" name="Picture 4"/>
             <wp:cNvGraphicFramePr>
               <a:graphicFrameLocks xmlns:a="http://schemas.openxmlformats.org/drawingml/2006/main" noChangeAspect="1"/>
             </wp:cNvGraphicFramePr>
@@ -4897,11 +4729,17 @@
               <a:graphicData uri="http://schemas.openxmlformats.org/drawingml/2006/picture">
                 <pic:pic xmlns:pic="http://schemas.openxmlformats.org/drawingml/2006/picture">
                   <pic:nvPicPr>
-                    <pic:cNvPr id="2055710948" name=""/>
+                    <pic:cNvPr id="1622712656" name="Picture 1622712656"/>
                     <pic:cNvPicPr/>
                   </pic:nvPicPr>
                   <pic:blipFill>
-                    <a:blip r:embed="rId25"/>
+                    <a:blip r:embed="rId25" cstate="print">
+                      <a:extLst>
+                        <a:ext uri="{28A0092B-C50C-407E-A947-70E740481C1C}">
+                          <a14:useLocalDpi xmlns:a14="http://schemas.microsoft.com/office/drawing/2010/main" val="0"/>
+                        </a:ext>
+                      </a:extLst>
+                    </a:blip>
                     <a:stretch>
                       <a:fillRect/>
                     </a:stretch>
@@ -4909,7 +4747,7 @@
                   <pic:spPr>
                     <a:xfrm>
                       <a:off x="0" y="0"/>
-                      <a:ext cx="5731510" cy="2842895"/>
+                      <a:ext cx="5731510" cy="3402965"/>
                     </a:xfrm>
                     <a:prstGeom prst="rect">
                       <a:avLst/>
@@ -4923,42 +4761,16 @@
       </w:r>
       <w:r>
         <w:rPr>
-          <w:sz w:val="20"/>
-          <w:szCs w:val="20"/>
-          <w:lang w:val="en-US"/>
-        </w:rPr>
-        <w:br/>
-      </w:r>
-    </w:p>
-    <w:p>
-      <w:pPr>
-        <w:rPr>
-          <w:sz w:val="20"/>
-          <w:szCs w:val="20"/>
-          <w:lang w:val="en-US"/>
-        </w:rPr>
-      </w:pPr>
-    </w:p>
-    <w:p>
-      <w:pPr>
-        <w:rPr>
-          <w:sz w:val="20"/>
-          <w:szCs w:val="20"/>
-          <w:lang w:val="en-US"/>
-        </w:rPr>
-      </w:pPr>
-      <w:r>
-        <w:rPr>
-          <w:sz w:val="20"/>
-          <w:szCs w:val="20"/>
-          <w:lang w:val="en-US"/>
-        </w:rPr>
-        <w:lastRenderedPageBreak/>
+          <w:noProof/>
+          <w:sz w:val="20"/>
+          <w:szCs w:val="20"/>
+          <w:lang w:val="en-US"/>
+        </w:rPr>
         <w:drawing>
-          <wp:inline distT="0" distB="0" distL="0" distR="0" wp14:anchorId="6C88BD51" wp14:editId="6A7C7E21">
-            <wp:extent cx="5731510" cy="2910205"/>
+          <wp:inline distT="0" distB="0" distL="0" distR="0" wp14:anchorId="72E4B199" wp14:editId="5FA63B48">
+            <wp:extent cx="5731510" cy="1614805"/>
             <wp:effectExtent l="0" t="0" r="2540" b="4445"/>
-            <wp:docPr id="340847070" name="Picture 1"/>
+            <wp:docPr id="1256321524" name="Picture 5"/>
             <wp:cNvGraphicFramePr>
               <a:graphicFrameLocks xmlns:a="http://schemas.openxmlformats.org/drawingml/2006/main" noChangeAspect="1"/>
             </wp:cNvGraphicFramePr>
@@ -4966,11 +4778,17 @@
               <a:graphicData uri="http://schemas.openxmlformats.org/drawingml/2006/picture">
                 <pic:pic xmlns:pic="http://schemas.openxmlformats.org/drawingml/2006/picture">
                   <pic:nvPicPr>
-                    <pic:cNvPr id="340847070" name=""/>
+                    <pic:cNvPr id="1256321524" name="Picture 1256321524"/>
                     <pic:cNvPicPr/>
                   </pic:nvPicPr>
                   <pic:blipFill>
-                    <a:blip r:embed="rId26"/>
+                    <a:blip r:embed="rId26" cstate="print">
+                      <a:extLst>
+                        <a:ext uri="{28A0092B-C50C-407E-A947-70E740481C1C}">
+                          <a14:useLocalDpi xmlns:a14="http://schemas.microsoft.com/office/drawing/2010/main" val="0"/>
+                        </a:ext>
+                      </a:extLst>
+                    </a:blip>
                     <a:stretch>
                       <a:fillRect/>
                     </a:stretch>
@@ -4978,7 +4796,7 @@
                   <pic:spPr>
                     <a:xfrm>
                       <a:off x="0" y="0"/>
-                      <a:ext cx="5731510" cy="2910205"/>
+                      <a:ext cx="5731510" cy="1614805"/>
                     </a:xfrm>
                     <a:prstGeom prst="rect">
                       <a:avLst/>
@@ -4990,79 +4808,19 @@
           </wp:inline>
         </w:drawing>
       </w:r>
-    </w:p>
-    <w:p>
-      <w:pPr>
-        <w:rPr>
-          <w:sz w:val="20"/>
-          <w:szCs w:val="20"/>
-          <w:lang w:val="en-US"/>
-        </w:rPr>
-      </w:pPr>
-    </w:p>
-    <w:p>
-      <w:pPr>
-        <w:rPr>
-          <w:sz w:val="20"/>
-          <w:szCs w:val="20"/>
-          <w:lang w:val="en-US"/>
-        </w:rPr>
-      </w:pPr>
-      <w:r>
-        <w:rPr>
-          <w:b/>
-          <w:bCs/>
-          <w:sz w:val="20"/>
-          <w:szCs w:val="20"/>
-          <w:lang w:val="en-US"/>
-        </w:rPr>
-        <w:t xml:space="preserve">Installed </w:t>
-      </w:r>
-      <w:r>
-        <w:rPr>
-          <w:b/>
-          <w:bCs/>
-          <w:sz w:val="20"/>
-          <w:szCs w:val="20"/>
-          <w:lang w:val="en-US"/>
-        </w:rPr>
-        <w:t>tomcat</w:t>
-      </w:r>
-      <w:r>
-        <w:rPr>
-          <w:sz w:val="20"/>
-          <w:szCs w:val="20"/>
-          <w:lang w:val="en-US"/>
-        </w:rPr>
-        <w:t xml:space="preserve"> </w:t>
-      </w:r>
-      <w:r>
-        <w:rPr>
-          <w:sz w:val="20"/>
-          <w:szCs w:val="20"/>
-          <w:lang w:val="en-US"/>
-        </w:rPr>
-        <w:br/>
-      </w:r>
-      <w:r>
-        <w:rPr>
-          <w:sz w:val="20"/>
-          <w:szCs w:val="20"/>
-          <w:lang w:val="en-US"/>
-        </w:rPr>
-        <w:br/>
-      </w:r>
-      <w:r>
-        <w:rPr>
-          <w:sz w:val="20"/>
-          <w:szCs w:val="20"/>
-          <w:lang w:val="en-US"/>
-        </w:rPr>
+      <w:r>
+        <w:rPr>
+          <w:noProof/>
+          <w:sz w:val="20"/>
+          <w:szCs w:val="20"/>
+          <w:lang w:val="en-US"/>
+        </w:rPr>
+        <w:lastRenderedPageBreak/>
         <w:drawing>
-          <wp:inline distT="0" distB="0" distL="0" distR="0" wp14:anchorId="33A589E2" wp14:editId="2163D44B">
-            <wp:extent cx="5731510" cy="808355"/>
-            <wp:effectExtent l="0" t="0" r="2540" b="0"/>
-            <wp:docPr id="2139398259" name="Picture 1"/>
+          <wp:inline distT="0" distB="0" distL="0" distR="0" wp14:anchorId="066AA121" wp14:editId="460C4455">
+            <wp:extent cx="5731510" cy="3215640"/>
+            <wp:effectExtent l="0" t="0" r="2540" b="3810"/>
+            <wp:docPr id="589297582" name="Picture 6"/>
             <wp:cNvGraphicFramePr>
               <a:graphicFrameLocks xmlns:a="http://schemas.openxmlformats.org/drawingml/2006/main" noChangeAspect="1"/>
             </wp:cNvGraphicFramePr>
@@ -5070,11 +4828,17 @@
               <a:graphicData uri="http://schemas.openxmlformats.org/drawingml/2006/picture">
                 <pic:pic xmlns:pic="http://schemas.openxmlformats.org/drawingml/2006/picture">
                   <pic:nvPicPr>
-                    <pic:cNvPr id="2139398259" name=""/>
+                    <pic:cNvPr id="589297582" name="Picture 589297582"/>
                     <pic:cNvPicPr/>
                   </pic:nvPicPr>
                   <pic:blipFill>
-                    <a:blip r:embed="rId27"/>
+                    <a:blip r:embed="rId27" cstate="print">
+                      <a:extLst>
+                        <a:ext uri="{28A0092B-C50C-407E-A947-70E740481C1C}">
+                          <a14:useLocalDpi xmlns:a14="http://schemas.microsoft.com/office/drawing/2010/main" val="0"/>
+                        </a:ext>
+                      </a:extLst>
+                    </a:blip>
                     <a:stretch>
                       <a:fillRect/>
                     </a:stretch>
@@ -5082,7 +4846,7 @@
                   <pic:spPr>
                     <a:xfrm>
                       <a:off x="0" y="0"/>
-                      <a:ext cx="5731510" cy="808355"/>
+                      <a:ext cx="5731510" cy="3215640"/>
                     </a:xfrm>
                     <a:prstGeom prst="rect">
                       <a:avLst/>
@@ -5094,35 +4858,18 @@
           </wp:inline>
         </w:drawing>
       </w:r>
-    </w:p>
-    <w:p>
-      <w:pPr>
-        <w:rPr>
-          <w:sz w:val="20"/>
-          <w:szCs w:val="20"/>
-          <w:lang w:val="en-US"/>
-        </w:rPr>
-      </w:pPr>
-    </w:p>
-    <w:p>
-      <w:pPr>
-        <w:rPr>
-          <w:sz w:val="20"/>
-          <w:szCs w:val="20"/>
-          <w:lang w:val="en-US"/>
-        </w:rPr>
-      </w:pPr>
-      <w:r>
-        <w:rPr>
+      <w:r>
+        <w:rPr>
+          <w:noProof/>
           <w:sz w:val="20"/>
           <w:szCs w:val="20"/>
           <w:lang w:val="en-US"/>
         </w:rPr>
         <w:drawing>
-          <wp:inline distT="0" distB="0" distL="0" distR="0" wp14:anchorId="24DB724D" wp14:editId="041DF453">
-            <wp:extent cx="5731510" cy="1179195"/>
-            <wp:effectExtent l="0" t="0" r="2540" b="1905"/>
-            <wp:docPr id="240772509" name="Picture 1"/>
+          <wp:inline distT="0" distB="0" distL="0" distR="0" wp14:anchorId="2D3BE015" wp14:editId="7C8BA821">
+            <wp:extent cx="5731510" cy="3812540"/>
+            <wp:effectExtent l="0" t="0" r="2540" b="0"/>
+            <wp:docPr id="564531804" name="Picture 7"/>
             <wp:cNvGraphicFramePr>
               <a:graphicFrameLocks xmlns:a="http://schemas.openxmlformats.org/drawingml/2006/main" noChangeAspect="1"/>
             </wp:cNvGraphicFramePr>
@@ -5130,11 +4877,17 @@
               <a:graphicData uri="http://schemas.openxmlformats.org/drawingml/2006/picture">
                 <pic:pic xmlns:pic="http://schemas.openxmlformats.org/drawingml/2006/picture">
                   <pic:nvPicPr>
-                    <pic:cNvPr id="240772509" name=""/>
+                    <pic:cNvPr id="564531804" name="Picture 564531804"/>
                     <pic:cNvPicPr/>
                   </pic:nvPicPr>
                   <pic:blipFill>
-                    <a:blip r:embed="rId28"/>
+                    <a:blip r:embed="rId28">
+                      <a:extLst>
+                        <a:ext uri="{28A0092B-C50C-407E-A947-70E740481C1C}">
+                          <a14:useLocalDpi xmlns:a14="http://schemas.microsoft.com/office/drawing/2010/main" val="0"/>
+                        </a:ext>
+                      </a:extLst>
+                    </a:blip>
                     <a:stretch>
                       <a:fillRect/>
                     </a:stretch>
@@ -5142,7 +4895,7 @@
                   <pic:spPr>
                     <a:xfrm>
                       <a:off x="0" y="0"/>
-                      <a:ext cx="5731510" cy="1179195"/>
+                      <a:ext cx="5731510" cy="3812540"/>
                     </a:xfrm>
                     <a:prstGeom prst="rect">
                       <a:avLst/>
@@ -5154,33 +4907,29 @@
           </wp:inline>
         </w:drawing>
       </w:r>
-      <w:r>
-        <w:rPr>
-          <w:sz w:val="20"/>
-          <w:szCs w:val="20"/>
-          <w:lang w:val="en-US"/>
-        </w:rPr>
-        <w:br/>
-      </w:r>
-      <w:r>
-        <w:rPr>
-          <w:sz w:val="20"/>
-          <w:szCs w:val="20"/>
-          <w:lang w:val="en-US"/>
-        </w:rPr>
-        <w:br/>
-      </w:r>
-      <w:r>
-        <w:rPr>
-          <w:sz w:val="20"/>
-          <w:szCs w:val="20"/>
-          <w:lang w:val="en-US"/>
-        </w:rPr>
+    </w:p>
+    <w:p>
+      <w:pPr>
+        <w:rPr>
+          <w:b/>
+          <w:bCs/>
+          <w:sz w:val="28"/>
+          <w:szCs w:val="28"/>
+          <w:u w:val="single"/>
+        </w:rPr>
+      </w:pPr>
+      <w:r>
+        <w:rPr>
+          <w:sz w:val="20"/>
+          <w:szCs w:val="20"/>
+          <w:lang w:val="en-US"/>
+        </w:rPr>
+        <w:lastRenderedPageBreak/>
         <w:drawing>
-          <wp:inline distT="0" distB="0" distL="0" distR="0" wp14:anchorId="09A041B1" wp14:editId="67AE22FD">
-            <wp:extent cx="5731510" cy="1295400"/>
+          <wp:inline distT="0" distB="0" distL="0" distR="0" wp14:anchorId="263E6E86" wp14:editId="0CC0BB86">
+            <wp:extent cx="5731510" cy="3094355"/>
             <wp:effectExtent l="0" t="0" r="2540" b="0"/>
-            <wp:docPr id="2137853981" name="Picture 1"/>
+            <wp:docPr id="805119059" name="Picture 1"/>
             <wp:cNvGraphicFramePr>
               <a:graphicFrameLocks xmlns:a="http://schemas.openxmlformats.org/drawingml/2006/main" noChangeAspect="1"/>
             </wp:cNvGraphicFramePr>
@@ -5188,7 +4937,7 @@
               <a:graphicData uri="http://schemas.openxmlformats.org/drawingml/2006/picture">
                 <pic:pic xmlns:pic="http://schemas.openxmlformats.org/drawingml/2006/picture">
                   <pic:nvPicPr>
-                    <pic:cNvPr id="2137853981" name=""/>
+                    <pic:cNvPr id="805119059" name=""/>
                     <pic:cNvPicPr/>
                   </pic:nvPicPr>
                   <pic:blipFill>
@@ -5200,7 +4949,7 @@
                   <pic:spPr>
                     <a:xfrm>
                       <a:off x="0" y="0"/>
-                      <a:ext cx="5731510" cy="1295400"/>
+                      <a:ext cx="5731510" cy="3094355"/>
                     </a:xfrm>
                     <a:prstGeom prst="rect">
                       <a:avLst/>
@@ -5212,33 +4961,27 @@
           </wp:inline>
         </w:drawing>
       </w:r>
-      <w:r>
-        <w:rPr>
-          <w:sz w:val="20"/>
-          <w:szCs w:val="20"/>
-          <w:lang w:val="en-US"/>
-        </w:rPr>
-        <w:br/>
-      </w:r>
-      <w:r>
-        <w:rPr>
-          <w:sz w:val="20"/>
-          <w:szCs w:val="20"/>
-          <w:lang w:val="en-US"/>
-        </w:rPr>
-        <w:br/>
-      </w:r>
-      <w:r>
-        <w:rPr>
+    </w:p>
+    <w:p>
+      <w:pPr>
+        <w:rPr>
+          <w:sz w:val="20"/>
+          <w:szCs w:val="20"/>
+          <w:lang w:val="en-US"/>
+        </w:rPr>
+      </w:pPr>
+      <w:r>
+        <w:rPr>
+          <w:noProof/>
           <w:sz w:val="20"/>
           <w:szCs w:val="20"/>
           <w:lang w:val="en-US"/>
         </w:rPr>
         <w:drawing>
-          <wp:inline distT="0" distB="0" distL="0" distR="0" wp14:anchorId="7C5DFEA9" wp14:editId="1DEBF8B6">
-            <wp:extent cx="5800090" cy="678180"/>
-            <wp:effectExtent l="0" t="0" r="0" b="7620"/>
-            <wp:docPr id="388260394" name="Picture 1"/>
+          <wp:inline distT="0" distB="0" distL="0" distR="0" wp14:anchorId="2AB202FE" wp14:editId="45396609">
+            <wp:extent cx="5731510" cy="2324100"/>
+            <wp:effectExtent l="0" t="0" r="2540" b="0"/>
+            <wp:docPr id="966067518" name="Picture 8"/>
             <wp:cNvGraphicFramePr>
               <a:graphicFrameLocks xmlns:a="http://schemas.openxmlformats.org/drawingml/2006/main" noChangeAspect="1"/>
             </wp:cNvGraphicFramePr>
@@ -5246,11 +4989,17 @@
               <a:graphicData uri="http://schemas.openxmlformats.org/drawingml/2006/picture">
                 <pic:pic xmlns:pic="http://schemas.openxmlformats.org/drawingml/2006/picture">
                   <pic:nvPicPr>
-                    <pic:cNvPr id="388260394" name=""/>
+                    <pic:cNvPr id="966067518" name="Picture 966067518"/>
                     <pic:cNvPicPr/>
                   </pic:nvPicPr>
                   <pic:blipFill>
-                    <a:blip r:embed="rId30"/>
+                    <a:blip r:embed="rId30" cstate="print">
+                      <a:extLst>
+                        <a:ext uri="{28A0092B-C50C-407E-A947-70E740481C1C}">
+                          <a14:useLocalDpi xmlns:a14="http://schemas.microsoft.com/office/drawing/2010/main" val="0"/>
+                        </a:ext>
+                      </a:extLst>
+                    </a:blip>
                     <a:stretch>
                       <a:fillRect/>
                     </a:stretch>
@@ -5258,7 +5007,7 @@
                   <pic:spPr>
                     <a:xfrm>
                       <a:off x="0" y="0"/>
-                      <a:ext cx="5800090" cy="678180"/>
+                      <a:ext cx="5731510" cy="2324100"/>
                     </a:xfrm>
                     <a:prstGeom prst="rect">
                       <a:avLst/>
@@ -5270,43 +5019,44 @@
           </wp:inline>
         </w:drawing>
       </w:r>
-      <w:r>
-        <w:rPr>
-          <w:sz w:val="20"/>
-          <w:szCs w:val="20"/>
-          <w:lang w:val="en-US"/>
-        </w:rPr>
-        <w:br/>
-      </w:r>
-      <w:r>
-        <w:rPr>
-          <w:sz w:val="20"/>
-          <w:szCs w:val="20"/>
-          <w:lang w:val="en-US"/>
-        </w:rPr>
-        <w:br/>
-      </w:r>
-    </w:p>
-    <w:p>
-      <w:pPr>
-        <w:rPr>
-          <w:b/>
-          <w:bCs/>
-          <w:sz w:val="20"/>
-          <w:szCs w:val="20"/>
-          <w:lang w:val="en-US"/>
-        </w:rPr>
-      </w:pPr>
-      <w:r>
-        <w:rPr>
-          <w:b/>
-          <w:bCs/>
-          <w:sz w:val="20"/>
-          <w:szCs w:val="20"/>
-          <w:lang w:val="en-US"/>
-        </w:rPr>
-        <w:lastRenderedPageBreak/>
-        <w:t xml:space="preserve">Tomcat working on port </w:t>
+    </w:p>
+    <w:p>
+      <w:pPr>
+        <w:rPr>
+          <w:sz w:val="20"/>
+          <w:szCs w:val="20"/>
+          <w:lang w:val="en-US"/>
+        </w:rPr>
+      </w:pPr>
+    </w:p>
+    <w:p>
+      <w:pPr>
+        <w:rPr>
+          <w:b/>
+          <w:bCs/>
+          <w:sz w:val="28"/>
+          <w:szCs w:val="28"/>
+          <w:u w:val="single"/>
+        </w:rPr>
+      </w:pPr>
+    </w:p>
+    <w:p>
+      <w:pPr>
+        <w:rPr>
+          <w:sz w:val="20"/>
+          <w:szCs w:val="20"/>
+          <w:lang w:val="en-US"/>
+        </w:rPr>
+      </w:pPr>
+      <w:r>
+        <w:rPr>
+          <w:b/>
+          <w:bCs/>
+          <w:sz w:val="28"/>
+          <w:szCs w:val="28"/>
+          <w:u w:val="single"/>
+        </w:rPr>
+        <w:t>sample app</w:t>
       </w:r>
     </w:p>
     <w:p>
@@ -5320,12 +5070,15 @@
       <w:r>
         <w:rPr>
           <w:noProof/>
+          <w:sz w:val="20"/>
+          <w:szCs w:val="20"/>
+          <w:lang w:val="en-US"/>
         </w:rPr>
         <w:drawing>
-          <wp:inline distT="0" distB="0" distL="0" distR="0" wp14:anchorId="042B27CD" wp14:editId="00B1277A">
-            <wp:extent cx="5731510" cy="1729740"/>
-            <wp:effectExtent l="0" t="0" r="2540" b="3810"/>
-            <wp:docPr id="1659846592" name="Picture 1"/>
+          <wp:inline distT="0" distB="0" distL="0" distR="0" wp14:anchorId="0BCCDBB7" wp14:editId="208263BF">
+            <wp:extent cx="5731510" cy="1731645"/>
+            <wp:effectExtent l="0" t="0" r="2540" b="1905"/>
+            <wp:docPr id="802255351" name="Picture 1"/>
             <wp:cNvGraphicFramePr>
               <a:graphicFrameLocks xmlns:a="http://schemas.openxmlformats.org/drawingml/2006/main" noChangeAspect="1"/>
             </wp:cNvGraphicFramePr>
@@ -5333,10 +5086,8 @@
               <a:graphicData uri="http://schemas.openxmlformats.org/drawingml/2006/picture">
                 <pic:pic xmlns:pic="http://schemas.openxmlformats.org/drawingml/2006/picture">
                   <pic:nvPicPr>
-                    <pic:cNvPr id="0" name="Picture 209"/>
-                    <pic:cNvPicPr>
-                      <a:picLocks noChangeAspect="1" noChangeArrowheads="1"/>
-                    </pic:cNvPicPr>
+                    <pic:cNvPr id="802255351" name="Picture 802255351"/>
+                    <pic:cNvPicPr/>
                   </pic:nvPicPr>
                   <pic:blipFill>
                     <a:blip r:embed="rId31" cstate="print">
@@ -5346,23 +5097,18 @@
                         </a:ext>
                       </a:extLst>
                     </a:blip>
-                    <a:srcRect/>
                     <a:stretch>
                       <a:fillRect/>
                     </a:stretch>
                   </pic:blipFill>
-                  <pic:spPr bwMode="auto">
+                  <pic:spPr>
                     <a:xfrm>
                       <a:off x="0" y="0"/>
-                      <a:ext cx="5731510" cy="1729740"/>
+                      <a:ext cx="5731510" cy="1731645"/>
                     </a:xfrm>
                     <a:prstGeom prst="rect">
                       <a:avLst/>
                     </a:prstGeom>
-                    <a:noFill/>
-                    <a:ln>
-                      <a:noFill/>
-                    </a:ln>
                   </pic:spPr>
                 </pic:pic>
               </a:graphicData>
@@ -5374,6 +5120,486 @@
     <w:p>
       <w:pPr>
         <w:rPr>
+          <w:b/>
+          <w:bCs/>
+          <w:sz w:val="20"/>
+          <w:szCs w:val="20"/>
+        </w:rPr>
+      </w:pPr>
+      <w:r>
+        <w:rPr>
+          <w:sz w:val="20"/>
+          <w:szCs w:val="20"/>
+          <w:lang w:val="en-US"/>
+        </w:rPr>
+        <w:br/>
+      </w:r>
+    </w:p>
+    <w:p>
+      <w:pPr>
+        <w:rPr>
+          <w:b/>
+          <w:bCs/>
+          <w:sz w:val="20"/>
+          <w:szCs w:val="20"/>
+        </w:rPr>
+      </w:pPr>
+      <w:r>
+        <w:rPr>
+          <w:b/>
+          <w:bCs/>
+          <w:sz w:val="20"/>
+          <w:szCs w:val="20"/>
+        </w:rPr>
+        <w:lastRenderedPageBreak/>
+        <w:t>Final Result (SUCCESS STATE)</w:t>
+      </w:r>
+    </w:p>
+    <w:p>
+      <w:pPr>
+        <w:rPr>
+          <w:sz w:val="20"/>
+          <w:szCs w:val="20"/>
+        </w:rPr>
+      </w:pPr>
+      <w:r>
+        <w:rPr>
+          <w:sz w:val="20"/>
+          <w:szCs w:val="20"/>
+        </w:rPr>
+        <w:t>When everything is correct, you will see:</w:t>
+      </w:r>
+    </w:p>
+    <w:p>
+      <w:pPr>
+        <w:rPr>
+          <w:b/>
+          <w:bCs/>
+          <w:sz w:val="20"/>
+          <w:szCs w:val="20"/>
+        </w:rPr>
+      </w:pPr>
+      <w:r>
+        <w:rPr>
+          <w:rFonts w:ascii="Segoe UI Emoji" w:hAnsi="Segoe UI Emoji" w:cs="Segoe UI Emoji"/>
+          <w:b/>
+          <w:bCs/>
+          <w:sz w:val="20"/>
+          <w:szCs w:val="20"/>
+        </w:rPr>
+        <w:t>🌐</w:t>
+      </w:r>
+      <w:r>
+        <w:rPr>
+          <w:b/>
+          <w:bCs/>
+          <w:sz w:val="20"/>
+          <w:szCs w:val="20"/>
+        </w:rPr>
+        <w:t xml:space="preserve"> In browser:</w:t>
+      </w:r>
+    </w:p>
+    <w:p>
+      <w:pPr>
+        <w:rPr>
+          <w:sz w:val="20"/>
+          <w:szCs w:val="20"/>
+        </w:rPr>
+      </w:pPr>
+      <w:r>
+        <w:rPr>
+          <w:rFonts w:ascii="Segoe UI Symbol" w:hAnsi="Segoe UI Symbol" w:cs="Segoe UI Symbol"/>
+          <w:sz w:val="20"/>
+          <w:szCs w:val="20"/>
+        </w:rPr>
+        <w:t>✔</w:t>
+      </w:r>
+      <w:r>
+        <w:rPr>
+          <w:sz w:val="20"/>
+          <w:szCs w:val="20"/>
+        </w:rPr>
+        <w:t xml:space="preserve"> Bright Future Institute</w:t>
+      </w:r>
+      <w:r>
+        <w:rPr>
+          <w:sz w:val="20"/>
+          <w:szCs w:val="20"/>
+        </w:rPr>
+        <w:br/>
+      </w:r>
+      <w:r>
+        <w:rPr>
+          <w:rFonts w:ascii="Segoe UI Symbol" w:hAnsi="Segoe UI Symbol" w:cs="Segoe UI Symbol"/>
+          <w:sz w:val="20"/>
+          <w:szCs w:val="20"/>
+        </w:rPr>
+        <w:t>✔</w:t>
+      </w:r>
+      <w:r>
+        <w:rPr>
+          <w:sz w:val="20"/>
+          <w:szCs w:val="20"/>
+        </w:rPr>
+        <w:t xml:space="preserve"> Welcome to Our Institute</w:t>
+      </w:r>
+      <w:r>
+        <w:rPr>
+          <w:sz w:val="20"/>
+          <w:szCs w:val="20"/>
+        </w:rPr>
+        <w:br/>
+      </w:r>
+      <w:r>
+        <w:rPr>
+          <w:rFonts w:ascii="Segoe UI Symbol" w:hAnsi="Segoe UI Symbol" w:cs="Segoe UI Symbol"/>
+          <w:sz w:val="20"/>
+          <w:szCs w:val="20"/>
+        </w:rPr>
+        <w:t>✔</w:t>
+      </w:r>
+      <w:r>
+        <w:rPr>
+          <w:sz w:val="20"/>
+          <w:szCs w:val="20"/>
+        </w:rPr>
+        <w:t xml:space="preserve"> Director: Mohd Abdul Wasif</w:t>
+      </w:r>
+      <w:r>
+        <w:rPr>
+          <w:sz w:val="20"/>
+          <w:szCs w:val="20"/>
+        </w:rPr>
+        <w:br/>
+      </w:r>
+      <w:r>
+        <w:rPr>
+          <w:rFonts w:ascii="Segoe UI Symbol" w:hAnsi="Segoe UI Symbol" w:cs="Segoe UI Symbol"/>
+          <w:sz w:val="20"/>
+          <w:szCs w:val="20"/>
+        </w:rPr>
+        <w:t>✔</w:t>
+      </w:r>
+      <w:r>
+        <w:rPr>
+          <w:sz w:val="20"/>
+          <w:szCs w:val="20"/>
+        </w:rPr>
+        <w:t xml:space="preserve"> Contact: 7013090790</w:t>
+      </w:r>
+    </w:p>
+    <w:p>
+      <w:pPr>
+        <w:rPr>
+          <w:sz w:val="20"/>
+          <w:szCs w:val="20"/>
+        </w:rPr>
+      </w:pPr>
+      <w:r>
+        <w:rPr>
+          <w:sz w:val="20"/>
+          <w:szCs w:val="20"/>
+        </w:rPr>
+        <w:pict w14:anchorId="42E43E03">
+          <v:rect id="_x0000_i1042" style="width:0;height:1.5pt" o:hralign="center" o:hrstd="t" o:hr="t" fillcolor="#a0a0a0" stroked="f"/>
+        </w:pict>
+      </w:r>
+    </w:p>
+    <w:p>
+      <w:pPr>
+        <w:rPr>
+          <w:b/>
+          <w:bCs/>
+          <w:sz w:val="20"/>
+          <w:szCs w:val="20"/>
+        </w:rPr>
+      </w:pPr>
+      <w:r>
+        <w:rPr>
+          <w:rFonts w:ascii="Segoe UI Emoji" w:hAnsi="Segoe UI Emoji" w:cs="Segoe UI Emoji"/>
+          <w:b/>
+          <w:bCs/>
+          <w:sz w:val="20"/>
+          <w:szCs w:val="20"/>
+        </w:rPr>
+        <w:t>🏁</w:t>
+      </w:r>
+      <w:r>
+        <w:rPr>
+          <w:b/>
+          <w:bCs/>
+          <w:sz w:val="20"/>
+          <w:szCs w:val="20"/>
+        </w:rPr>
+        <w:t xml:space="preserve"> What you learned (IMPORTANT)</w:t>
+      </w:r>
+    </w:p>
+    <w:p>
+      <w:pPr>
+        <w:rPr>
+          <w:sz w:val="20"/>
+          <w:szCs w:val="20"/>
+        </w:rPr>
+      </w:pPr>
+      <w:r>
+        <w:rPr>
+          <w:rFonts w:ascii="Segoe UI Symbol" w:hAnsi="Segoe UI Symbol" w:cs="Segoe UI Symbol"/>
+          <w:sz w:val="20"/>
+          <w:szCs w:val="20"/>
+        </w:rPr>
+        <w:t>✔</w:t>
+      </w:r>
+      <w:r>
+        <w:rPr>
+          <w:sz w:val="20"/>
+          <w:szCs w:val="20"/>
+        </w:rPr>
+        <w:t xml:space="preserve"> AWS VPC architecture (public + private subnet)</w:t>
+      </w:r>
+      <w:r>
+        <w:rPr>
+          <w:sz w:val="20"/>
+          <w:szCs w:val="20"/>
+        </w:rPr>
+        <w:br/>
+      </w:r>
+      <w:r>
+        <w:rPr>
+          <w:rFonts w:ascii="Segoe UI Symbol" w:hAnsi="Segoe UI Symbol" w:cs="Segoe UI Symbol"/>
+          <w:sz w:val="20"/>
+          <w:szCs w:val="20"/>
+        </w:rPr>
+        <w:t>✔</w:t>
+      </w:r>
+      <w:r>
+        <w:rPr>
+          <w:sz w:val="20"/>
+          <w:szCs w:val="20"/>
+        </w:rPr>
+        <w:t xml:space="preserve"> Bastion host concept</w:t>
+      </w:r>
+      <w:r>
+        <w:rPr>
+          <w:sz w:val="20"/>
+          <w:szCs w:val="20"/>
+        </w:rPr>
+        <w:br/>
+      </w:r>
+      <w:r>
+        <w:rPr>
+          <w:rFonts w:ascii="Segoe UI Symbol" w:hAnsi="Segoe UI Symbol" w:cs="Segoe UI Symbol"/>
+          <w:sz w:val="20"/>
+          <w:szCs w:val="20"/>
+        </w:rPr>
+        <w:t>✔</w:t>
+      </w:r>
+      <w:r>
+        <w:rPr>
+          <w:sz w:val="20"/>
+          <w:szCs w:val="20"/>
+        </w:rPr>
+        <w:t xml:space="preserve"> SSH </w:t>
+      </w:r>
+      <w:proofErr w:type="spellStart"/>
+      <w:r>
+        <w:rPr>
+          <w:sz w:val="20"/>
+          <w:szCs w:val="20"/>
+        </w:rPr>
+        <w:t>tunneling</w:t>
+      </w:r>
+      <w:proofErr w:type="spellEnd"/>
+      <w:r>
+        <w:rPr>
+          <w:sz w:val="20"/>
+          <w:szCs w:val="20"/>
+        </w:rPr>
+        <w:t xml:space="preserve"> (port forwarding)</w:t>
+      </w:r>
+      <w:r>
+        <w:rPr>
+          <w:sz w:val="20"/>
+          <w:szCs w:val="20"/>
+        </w:rPr>
+        <w:br/>
+      </w:r>
+      <w:r>
+        <w:rPr>
+          <w:rFonts w:ascii="Segoe UI Symbol" w:hAnsi="Segoe UI Symbol" w:cs="Segoe UI Symbol"/>
+          <w:sz w:val="20"/>
+          <w:szCs w:val="20"/>
+        </w:rPr>
+        <w:t>✔</w:t>
+      </w:r>
+      <w:r>
+        <w:rPr>
+          <w:sz w:val="20"/>
+          <w:szCs w:val="20"/>
+        </w:rPr>
+        <w:t xml:space="preserve"> Deploying web apps on Tomcat</w:t>
+      </w:r>
+      <w:r>
+        <w:rPr>
+          <w:sz w:val="20"/>
+          <w:szCs w:val="20"/>
+        </w:rPr>
+        <w:br/>
+      </w:r>
+      <w:r>
+        <w:rPr>
+          <w:rFonts w:ascii="Segoe UI Symbol" w:hAnsi="Segoe UI Symbol" w:cs="Segoe UI Symbol"/>
+          <w:sz w:val="20"/>
+          <w:szCs w:val="20"/>
+        </w:rPr>
+        <w:t>✔</w:t>
+      </w:r>
+      <w:r>
+        <w:rPr>
+          <w:sz w:val="20"/>
+          <w:szCs w:val="20"/>
+        </w:rPr>
+        <w:t xml:space="preserve"> Real-world secure server access</w:t>
+      </w:r>
+    </w:p>
+    <w:p>
+      <w:pPr>
+        <w:rPr>
+          <w:sz w:val="20"/>
+          <w:szCs w:val="20"/>
+          <w:lang w:val="en-US"/>
+        </w:rPr>
+      </w:pPr>
+      <w:r>
+        <w:rPr>
+          <w:sz w:val="20"/>
+          <w:szCs w:val="20"/>
+          <w:lang w:val="en-US"/>
+        </w:rPr>
+        <w:br/>
+      </w:r>
+    </w:p>
+    <w:p>
+      <w:pPr>
+        <w:rPr>
+          <w:b/>
+          <w:bCs/>
+          <w:sz w:val="20"/>
+          <w:szCs w:val="20"/>
+          <w:u w:val="single"/>
+          <w:lang w:val="en-US"/>
+        </w:rPr>
+      </w:pPr>
+    </w:p>
+    <w:p>
+      <w:pPr>
+        <w:rPr>
+          <w:lang w:val="en-US"/>
+        </w:rPr>
+      </w:pPr>
+      <w:r>
+        <w:rPr>
+          <w:b/>
+          <w:bCs/>
+          <w:u w:val="single"/>
+          <w:lang w:val="en-US"/>
+        </w:rPr>
+        <w:t>What We learnt</w:t>
+      </w:r>
+      <w:r>
+        <w:rPr>
+          <w:lang w:val="en-US"/>
+        </w:rPr>
+        <w:t xml:space="preserve"> </w:t>
+      </w:r>
+    </w:p>
+    <w:p>
+      <w:r>
+        <w:t>We learned how to create a VPC with public and private subnets in AWS.</w:t>
+      </w:r>
+      <w:r>
+        <w:br/>
+        <w:t>We used a Bastion Host to securely access a private EC2 instance.</w:t>
+      </w:r>
+      <w:r>
+        <w:br/>
+        <w:t>We installed Java and Apache Tomcat and deployed a web application.</w:t>
+      </w:r>
+      <w:r>
+        <w:br/>
+        <w:t xml:space="preserve">We understood why private EC2 cannot be accessed directly and used SSH </w:t>
+      </w:r>
+      <w:proofErr w:type="spellStart"/>
+      <w:r>
+        <w:t>tunneling</w:t>
+      </w:r>
+      <w:proofErr w:type="spellEnd"/>
+      <w:r>
+        <w:t>.</w:t>
+      </w:r>
+      <w:r>
+        <w:br/>
+        <w:t>We successfully hosted and accessed a website securely using AWS architecture.</w:t>
+      </w:r>
+    </w:p>
+    <w:p>
+      <w:pPr>
+        <w:rPr>
+          <w:sz w:val="20"/>
+          <w:szCs w:val="20"/>
+          <w:lang w:val="en-US"/>
+        </w:rPr>
+      </w:pPr>
+      <w:r>
+        <w:rPr>
+          <w:lang w:val="en-US"/>
+        </w:rPr>
+        <w:br/>
+      </w:r>
+      <w:r>
+        <w:rPr>
+          <w:sz w:val="20"/>
+          <w:szCs w:val="20"/>
+          <w:lang w:val="en-US"/>
+        </w:rPr>
+        <w:br/>
+      </w:r>
+      <w:r>
+        <w:rPr>
+          <w:sz w:val="20"/>
+          <w:szCs w:val="20"/>
+          <w:lang w:val="en-US"/>
+        </w:rPr>
+        <w:br/>
+      </w:r>
+      <w:r>
+        <w:rPr>
+          <w:sz w:val="20"/>
+          <w:szCs w:val="20"/>
+          <w:lang w:val="en-US"/>
+        </w:rPr>
+        <w:br/>
+      </w:r>
+      <w:r>
+        <w:rPr>
+          <w:sz w:val="20"/>
+          <w:szCs w:val="20"/>
+          <w:lang w:val="en-US"/>
+        </w:rPr>
+        <w:br/>
+      </w:r>
+    </w:p>
+    <w:p>
+      <w:pPr>
+        <w:rPr>
+          <w:sz w:val="20"/>
+          <w:szCs w:val="20"/>
+          <w:lang w:val="en-US"/>
+        </w:rPr>
+      </w:pPr>
+    </w:p>
+    <w:p>
+      <w:pPr>
+        <w:rPr>
           <w:sz w:val="20"/>
           <w:szCs w:val="20"/>
           <w:lang w:val="en-US"/>
@@ -5441,17 +5667,8 @@
           <w:szCs w:val="28"/>
           <w:u w:val="single"/>
         </w:rPr>
-        <w:t>10.</w:t>
-      </w:r>
-      <w:r>
-        <w:rPr>
-          <w:b/>
-          <w:bCs/>
-          <w:sz w:val="28"/>
-          <w:szCs w:val="28"/>
-          <w:u w:val="single"/>
-        </w:rPr>
-        <w:t>Configure VPC flow logs and store the logs in S3 and CloudWatch.</w:t>
+        <w:lastRenderedPageBreak/>
+        <w:t>10.Configure VPC flow logs and store the logs in S3 and CloudWatch.</w:t>
       </w:r>
     </w:p>
     <w:p>
@@ -5907,7 +6124,6 @@
           <w:sz w:val="28"/>
           <w:szCs w:val="28"/>
         </w:rPr>
-        <w:lastRenderedPageBreak/>
         <w:t xml:space="preserve">Select </w:t>
       </w:r>
       <w:r>
@@ -6162,11 +6378,13 @@
         <w:rPr>
           <w:b/>
           <w:bCs/>
-          <w:sz w:val="28"/>
-          <w:szCs w:val="28"/>
-          <w:u w:val="single"/>
-          <w:lang w:val="en-US"/>
-        </w:rPr>
+          <w:noProof/>
+          <w:sz w:val="28"/>
+          <w:szCs w:val="28"/>
+          <w:u w:val="single"/>
+          <w:lang w:val="en-US"/>
+        </w:rPr>
+        <w:lastRenderedPageBreak/>
         <w:drawing>
           <wp:inline distT="0" distB="0" distL="0" distR="0" wp14:anchorId="6D0FB663" wp14:editId="261B01B4">
             <wp:extent cx="5731510" cy="3240405"/>
@@ -6231,12 +6449,12 @@
         <w:rPr>
           <w:b/>
           <w:bCs/>
-          <w:sz w:val="28"/>
-          <w:szCs w:val="28"/>
-          <w:u w:val="single"/>
-          <w:lang w:val="en-US"/>
-        </w:rPr>
-        <w:lastRenderedPageBreak/>
+          <w:noProof/>
+          <w:sz w:val="28"/>
+          <w:szCs w:val="28"/>
+          <w:u w:val="single"/>
+          <w:lang w:val="en-US"/>
+        </w:rPr>
         <w:drawing>
           <wp:inline distT="0" distB="0" distL="0" distR="0" wp14:anchorId="5B5443C9" wp14:editId="672AA565">
             <wp:extent cx="5731510" cy="2700020"/>
@@ -6325,11 +6543,13 @@
         <w:rPr>
           <w:b/>
           <w:bCs/>
-          <w:sz w:val="28"/>
-          <w:szCs w:val="28"/>
-          <w:u w:val="single"/>
-          <w:lang w:val="en-US"/>
-        </w:rPr>
+          <w:noProof/>
+          <w:sz w:val="28"/>
+          <w:szCs w:val="28"/>
+          <w:u w:val="single"/>
+          <w:lang w:val="en-US"/>
+        </w:rPr>
+        <w:lastRenderedPageBreak/>
         <w:drawing>
           <wp:inline distT="0" distB="0" distL="0" distR="0" wp14:anchorId="2FB91AF1" wp14:editId="5B55C19A">
             <wp:extent cx="5731510" cy="2240280"/>
@@ -6441,6 +6661,7 @@
         <w:rPr>
           <w:b/>
           <w:bCs/>
+          <w:noProof/>
           <w:sz w:val="28"/>
           <w:szCs w:val="28"/>
           <w:u w:val="single"/>
@@ -10646,6 +10867,17 @@
     <w:uiPriority w:val="99"/>
     <w:rsid w:val="004E6473"/>
   </w:style>
+  <w:style w:type="paragraph" w:styleId="NormalWeb">
+    <w:name w:val="Normal (Web)"/>
+    <w:basedOn w:val="Normal"/>
+    <w:uiPriority w:val="99"/>
+    <w:semiHidden/>
+    <w:unhideWhenUsed/>
+    <w:rsid w:val="00C1147C"/>
+    <w:rPr>
+      <w:rFonts w:ascii="Times New Roman" w:hAnsi="Times New Roman" w:cs="Times New Roman"/>
+    </w:rPr>
+  </w:style>
 </w:styles>
 </file>
 

</xml_diff>